<commit_message>
Refresh Figure 1 (clean diagram) in article pages and Word docs
</commit_message>
<xml_diff>
--- a/whitepaper/Securing-the-Agentic-Enterprise-Part-1.docx
+++ b/whitepaper/Securing-the-Agentic-Enterprise-Part-1.docx
@@ -821,7 +821,7 @@
       <w:r>
         <w:drawing>
           <wp:inline xmlns:a="http://schemas.openxmlformats.org/drawingml/2006/main" xmlns:pic="http://schemas.openxmlformats.org/drawingml/2006/picture">
-            <wp:extent cx="6035040" cy="3640811"/>
+            <wp:extent cx="6035040" cy="3616077"/>
             <wp:docPr id="1" name="Picture 1"/>
             <wp:cNvGraphicFramePr>
               <a:graphicFrameLocks noChangeAspect="1"/>
@@ -842,7 +842,7 @@
                   <pic:spPr>
                     <a:xfrm>
                       <a:off x="0" y="0"/>
-                      <a:ext cx="6035040" cy="3640811"/>
+                      <a:ext cx="6035040" cy="3616077"/>
                     </a:xfrm>
                     <a:prstGeom prst="rect"/>
                   </pic:spPr>

</xml_diff>

<commit_message>
Devil's-advocate pass: expand taxonomy to 42 risks, add incident index + search + about/methodology + article TOC, reconcile trust boundaries and counts, fix overclaims
</commit_message>
<xml_diff>
--- a/whitepaper/Securing-the-Agentic-Enterprise-Part-1.docx
+++ b/whitepaper/Securing-the-Agentic-Enterprise-Part-1.docx
@@ -384,7 +384,7 @@
                 <w:color w:val="12230F"/>
                 <w:sz w:val="20"/>
               </w:rPr>
-              <w:t>The root flaw is one shared context window holding trusted instructions and untrusted data. No product separates the two, and every classifier built to try, including Microsoft's XPIA, has been bypassed.</w:t>
+              <w:t>The root flaw is one shared context window holding trusted instructions and untrusted data. No product separates the two, and classifiers built to try, including Microsoft's XPIA, have been bypassed.</w:t>
             </w:r>
           </w:p>
           <w:p>
@@ -450,7 +450,7 @@
                 <w:color w:val="12230F"/>
                 <w:sz w:val="20"/>
               </w:rPr>
-              <w:t>Every one of the eight attack families below already has a real, named, in-the-wild incident. This is not a forecast.</w:t>
+              <w:t>Every one of the eight attack families below has at least one real, named example; the consequential injection, identity, and exfil families have in-the-wild incidents, while a few load-bearing examples (Morris II, Sleeper Agents, Agentic Misalignment) are controlled research demonstrations whose enabling conditions already exist in production. This is not a forecast.</w:t>
             </w:r>
           </w:p>
         </w:tc>
@@ -1311,7 +1311,7 @@
           <w:color w:val="141821"/>
           <w:sz w:val="21"/>
         </w:rPr>
-        <w:t>This crosses L1 into L4 into L3, violating the boundary between untrusted content and the instruction context (TB1 into TB2). It is enterprise-relevant because every connected copilot (M365 Copilot, Gemini for Workspace, Agentforce, ChatGPT Deep Research) is wired to untrusted-text channels, so any of them can be hijacked by an outsider who never authenticates. Every classifier built to catch this, including Microsoft's own XPIA, has been bypassed in the wild. This is the one family with no buy-a-tool fix.</w:t>
+        <w:t>This crosses L1 into L4 into L3, violating the boundary between untrusted content and the instruction context (TB1 into TB2). It is enterprise-relevant because every connected copilot (M365 Copilot, Gemini for Workspace, Agentforce, ChatGPT Deep Research) is wired to untrusted-text channels, so any of them can be hijacked by an outsider who never authenticates. Classifiers built to catch this, including Microsoft's own XPIA, have been bypassed, and the approach is bypassable by construction because the classifier parses the same ambiguous stream as the model. This is the one family with no buy-a-tool fix.</w:t>
       </w:r>
     </w:p>
     <w:p>
@@ -1673,7 +1673,7 @@
           <w:color w:val="141821"/>
           <w:sz w:val="21"/>
         </w:rPr>
-        <w:t>This crosses L7, violating the boundary between an ephemeral session and a durable store (TB3 in the memory sense). It is enterprise-relevant because persistent memory is shipping in consumer and enterprise assistants and enterprise RAG grounds answers in shared corpora (SharePoint, wikis, ticket systems). Most input classifiers screen the live turn, not what was previously written into memory, so persistence is the durable gap, and shared memory banks risk cross-user contamination that no shipping product fully prevents.</w:t>
+        <w:t>This crosses L7, violating the same untrusted-content to instruction-context boundary as F1 but in its persistent form (TB1, re-entering the model's context window at TB2 on every future session). It is enterprise-relevant because persistent memory is shipping in consumer and enterprise assistants and enterprise RAG grounds answers in shared corpora (SharePoint, wikis, ticket systems). Most input classifiers screen the live turn, not what was previously written into memory, so persistence is the durable gap, and shared memory banks risk cross-user contamination that no shipping product fully prevents.</w:t>
       </w:r>
     </w:p>
     <w:p>
@@ -2557,7 +2557,7 @@
                 <w:color w:val="3A0F0F"/>
                 <w:sz w:val="20"/>
               </w:rPr>
-              <w:t>Two families on this tour have no product fix. F1 (prompt injection) is an open problem: no control reliably separates trusted instruction from untrusted data in one context window, and every classifier including XPIA has been bypassed. F6's latent backdoors are an open problem too: standard safety training fails to remove a hidden trigger and can teach the model to conceal it better. These are not buy-a-tool problems, and any vendor claiming to solve them is overselling.</w:t>
+              <w:t>Two families on this tour have no product fix. F1 (prompt injection) is an open problem: no control reliably separates trusted instruction from untrusted data in one context window, and classifiers built to try, including XPIA, have been bypassed. F6's latent backdoors are an open problem too: standard safety training fails to remove a hidden trigger and can teach the model to conceal it better. These are not buy-a-tool problems, and any vendor claiming to solve them is overselling.</w:t>
             </w:r>
           </w:p>
         </w:tc>
@@ -3751,13 +3751,13 @@
             <w:pPr>
               <w:spacing w:after="20"/>
             </w:pPr>
-            <w:hyperlink r:id="rId26">
+            <w:hyperlink r:id="rId29">
               <w:r>
                 <w:rPr>
                   <w:color w:val="2F6FED"/>
                   <w:u w:val="single"/>
                 </w:rPr>
-                <w:t xml:space="preserve">CamoLeak: Critical GitHub Copilot Vulnerability Leaks Priv...</w:t>
+                <w:t xml:space="preserve">CVE-2025-67744: DeepChat Remote Code Execution via Mermaid...</w:t>
               </w:r>
             </w:hyperlink>
           </w:p>
@@ -3786,7 +3786,7 @@
                 <w:color w:val="141821"/>
                 <w:sz w:val="19"/>
               </w:rPr>
-              <w:t>L6 L10 L4</w:t>
+              <w:t>L6 L2 L10</w:t>
             </w:r>
           </w:p>
         </w:tc>
@@ -3842,7 +3842,7 @@
                 <w:color w:val="141821"/>
                 <w:sz w:val="19"/>
               </w:rPr>
-              <w:t>High</w:t>
+              <w:t>Critical</w:t>
             </w:r>
           </w:p>
         </w:tc>
@@ -4007,7 +4007,7 @@
                 <w:color w:val="12230F"/>
                 <w:sz w:val="20"/>
               </w:rPr>
-              <w:t>TB2 model-intent to real-world-action: text becomes a shell command, DB write, or payment with no policy gate.</w:t>
+              <w:t>TB2 model and context-window boundary: trusted instructions and untrusted data share one token stream the model cannot partition, and a one-shot injection written to memory or a corpus re-enters here on every future session.</w:t>
             </w:r>
           </w:p>
           <w:p>
@@ -4029,7 +4029,7 @@
                 <w:color w:val="12230F"/>
                 <w:sz w:val="20"/>
               </w:rPr>
-              <w:t>TB3 ephemeral-session to durable-store: a one-shot injection is written into memory or a RAG corpus and resurfaces.</w:t>
+              <w:t>TB3 model-intent to real-world-action: text becomes a shell command, DB write, or payment with no policy gate.</w:t>
             </w:r>
           </w:p>
           <w:p>
@@ -4073,7 +4073,7 @@
                 <w:color w:val="12230F"/>
                 <w:sz w:val="20"/>
               </w:rPr>
-              <w:t>TB5 external-artifact to trusted-pipeline: a model, package, or MCP server compromised before runtime runs as trusted.</w:t>
+              <w:t>TB5 self to peer-agent or external service: a remote agent's output is consumed as trusted instruction across a compromisable domain.</w:t>
             </w:r>
           </w:p>
           <w:p>
@@ -4095,7 +4095,7 @@
                 <w:color w:val="12230F"/>
                 <w:sz w:val="20"/>
               </w:rPr>
-              <w:t>TB6 self to peer-agent: a remote agent's output is consumed as trusted instruction across a compromisable domain.</w:t>
+              <w:t>TB6 external-artifact to trusted supply chain: a model, package, or MCP server compromised before runtime runs as trusted.</w:t>
             </w:r>
           </w:p>
           <w:p>
@@ -4207,7 +4207,57 @@
           <w:color w:val="141821"/>
           <w:sz w:val="21"/>
         </w:rPr>
-        <w:t xml:space="preserve">TB2, model-intent to real-world-action. The point where model-generated text becomes a side effect: an API call, a shell command, a DB write, a payment, an email send. Function-calling and MCP sit here. Crossing TB2 without a policy gate is what converts a successful injection into damage. The </w:t>
+        <w:t xml:space="preserve">TB2, the model and context-window boundary. The point where the assembled prompt enters the model as one undifferentiated token stream the model cannot reliably partition into instruction and data, which is the structural root of injection and the seam where model-level failures live. Memory and RAG poisoning cross here in their persistent form: the </w:t>
+      </w:r>
+      <w:r>
+        <w:rPr>
+          <w:b/>
+          <w:i w:val="0"/>
+          <w:color w:val="141821"/>
+          <w:sz w:val="21"/>
+        </w:rPr>
+        <w:t>SpAIware</w:t>
+      </w:r>
+      <w:r>
+        <w:rPr>
+          <w:b w:val="0"/>
+          <w:i w:val="0"/>
+          <w:color w:val="141821"/>
+          <w:sz w:val="21"/>
+        </w:rPr>
+        <w:t xml:space="preserve"> attack (</w:t>
+      </w:r>
+      <w:hyperlink r:id="rId16">
+        <w:r>
+          <w:rPr>
+            <w:color w:val="2F6FED"/>
+            <w:u w:val="single"/>
+          </w:rPr>
+          <w:t xml:space="preserve">source</w:t>
+        </w:r>
+      </w:hyperlink>
+      <w:r>
+        <w:rPr>
+          <w:b w:val="0"/>
+          <w:i w:val="0"/>
+          <w:color w:val="141821"/>
+          <w:sz w:val="21"/>
+        </w:rPr>
+        <w:t>) wrote an attacker directive into ChatGPT's long-term memory that re-entered the context window and re-executed on every subsequent session, and the latent-backdoor failure of family F6 is a TB2 crossing in the weights themselves. Families F1 (after TB1), F3, and F6 all converge here.</w:t>
+      </w:r>
+    </w:p>
+    <w:p>
+      <w:pPr>
+        <w:spacing w:after="120" w:line="300" w:lineRule="auto"/>
+      </w:pPr>
+      <w:r>
+        <w:rPr>
+          <w:b w:val="0"/>
+          <w:i w:val="0"/>
+          <w:color w:val="141821"/>
+          <w:sz w:val="21"/>
+        </w:rPr>
+        <w:t xml:space="preserve">TB3, model-intent to real-world-action. The point where model-generated text becomes a side effect: an API call, a shell command, a DB write, a payment, an email send. Function-calling and MCP sit here. Crossing TB3 without a policy gate is what converts a successful injection into damage. The </w:t>
       </w:r>
       <w:r>
         <w:rPr>
@@ -4261,57 +4311,7 @@
           <w:color w:val="141821"/>
           <w:sz w:val="21"/>
         </w:rPr>
-        <w:t>) crossed TB2 by writing its own auto-approve setting, then executing arbitrary commands with no further prompt. Family F2 lives on this boundary.</w:t>
-      </w:r>
-    </w:p>
-    <w:p>
-      <w:pPr>
-        <w:spacing w:after="120" w:line="300" w:lineRule="auto"/>
-      </w:pPr>
-      <w:r>
-        <w:rPr>
-          <w:b w:val="0"/>
-          <w:i w:val="0"/>
-          <w:color w:val="141821"/>
-          <w:sz w:val="21"/>
-        </w:rPr>
-        <w:t xml:space="preserve">TB3, ephemeral-session to durable-store. The line between a single conversation and persistent state: long-term memory, a RAG corpus, a vector index. A one-shot injection that crosses TB3 stops being one-shot. The </w:t>
-      </w:r>
-      <w:r>
-        <w:rPr>
-          <w:b/>
-          <w:i w:val="0"/>
-          <w:color w:val="141821"/>
-          <w:sz w:val="21"/>
-        </w:rPr>
-        <w:t>SpAIware</w:t>
-      </w:r>
-      <w:r>
-        <w:rPr>
-          <w:b w:val="0"/>
-          <w:i w:val="0"/>
-          <w:color w:val="141821"/>
-          <w:sz w:val="21"/>
-        </w:rPr>
-        <w:t xml:space="preserve"> attack (</w:t>
-      </w:r>
-      <w:hyperlink r:id="rId16">
-        <w:r>
-          <w:rPr>
-            <w:color w:val="2F6FED"/>
-            <w:u w:val="single"/>
-          </w:rPr>
-          <w:t xml:space="preserve">source</w:t>
-        </w:r>
-      </w:hyperlink>
-      <w:r>
-        <w:rPr>
-          <w:b w:val="0"/>
-          <w:i w:val="0"/>
-          <w:color w:val="141821"/>
-          <w:sz w:val="21"/>
-        </w:rPr>
-        <w:t>) wrote an attacker directive into ChatGPT's long-term memory, where it re-executed on every subsequent session. Family F3.</w:t>
+        <w:t>) crossed TB3 by writing its own auto-approve setting, then executing arbitrary commands with no further prompt. Family F2 lives on this boundary.</w:t>
       </w:r>
     </w:p>
     <w:p>
@@ -4375,57 +4375,7 @@
           <w:color w:val="141821"/>
           <w:sz w:val="21"/>
         </w:rPr>
-        <w:t xml:space="preserve">TB5, external-artifact to trusted-pipeline. Trust in the origin and integrity of a model, package, MCP server, or dependency before it runs. Compromise here is pre-runtime and silent. The brief frames this as the supply-chain boundary (TB6 in its numbering); we group it under the external-to-trusted seam because the defensive logic is identical, verify provenance before execution. The </w:t>
-      </w:r>
-      <w:r>
-        <w:rPr>
-          <w:b/>
-          <w:i w:val="0"/>
-          <w:color w:val="141821"/>
-          <w:sz w:val="21"/>
-        </w:rPr>
-        <w:t>nullifAI</w:t>
-      </w:r>
-      <w:r>
-        <w:rPr>
-          <w:b w:val="0"/>
-          <w:i w:val="0"/>
-          <w:color w:val="141821"/>
-          <w:sz w:val="21"/>
-        </w:rPr>
-        <w:t xml:space="preserve"> malicious models on Hugging Face (</w:t>
-      </w:r>
-      <w:hyperlink r:id="rId18">
-        <w:r>
-          <w:rPr>
-            <w:color w:val="2F6FED"/>
-            <w:u w:val="single"/>
-          </w:rPr>
-          <w:t xml:space="preserve">source</w:t>
-        </w:r>
-      </w:hyperlink>
-      <w:r>
-        <w:rPr>
-          <w:b w:val="0"/>
-          <w:i w:val="0"/>
-          <w:color w:val="141821"/>
-          <w:sz w:val="21"/>
-        </w:rPr>
-        <w:t>) crossed it: loading a poisoned artifact from a public hub executed attacker code inside the loading process. Family F5.</w:t>
-      </w:r>
-    </w:p>
-    <w:p>
-      <w:pPr>
-        <w:spacing w:after="120" w:line="300" w:lineRule="auto"/>
-      </w:pPr>
-      <w:r>
-        <w:rPr>
-          <w:b w:val="0"/>
-          <w:i w:val="0"/>
-          <w:color w:val="141821"/>
-          <w:sz w:val="21"/>
-        </w:rPr>
-        <w:t xml:space="preserve">TB6, self to peer-agent. Trust placed in another agent across an A2A mesh. Each remote agent is a separate, independently-compromisable trust domain, yet the agent card that declares its identity is self-asserted. The author's research auditor </w:t>
+        <w:t xml:space="preserve">TB5, self to peer-agent or external service. Trust placed in another agent across an A2A mesh. Each remote agent is a separate, independently-compromisable trust domain, yet the agent card that declares its identity is self-asserted. The author's research auditor </w:t>
       </w:r>
       <w:r>
         <w:rPr>
@@ -4497,7 +4447,57 @@
           <w:color w:val="141821"/>
           <w:sz w:val="21"/>
         </w:rPr>
-        <w:t>) crossed TB6 by publishing a forged card that hijacked an LLM-as-judge orchestrator into routing tasks to a malicious agent before any auth handshake ran. Family F7.</w:t>
+        <w:t>) crossed TB5 by publishing a forged card that hijacked an LLM-as-judge orchestrator into routing tasks to a malicious agent before any auth handshake ran. Family F7.</w:t>
+      </w:r>
+    </w:p>
+    <w:p>
+      <w:pPr>
+        <w:spacing w:after="120" w:line="300" w:lineRule="auto"/>
+      </w:pPr>
+      <w:r>
+        <w:rPr>
+          <w:b w:val="0"/>
+          <w:i w:val="0"/>
+          <w:color w:val="141821"/>
+          <w:sz w:val="21"/>
+        </w:rPr>
+        <w:t xml:space="preserve">TB6, external-artifact to trusted supply chain. Trust in the origin and integrity of a model, package, MCP server, or dependency before it runs. Compromise here is pre-runtime and silent. The defensive logic is the same wherever an externally-sourced artifact enters a trusted pipeline: verify provenance before execution. The </w:t>
+      </w:r>
+      <w:r>
+        <w:rPr>
+          <w:b/>
+          <w:i w:val="0"/>
+          <w:color w:val="141821"/>
+          <w:sz w:val="21"/>
+        </w:rPr>
+        <w:t>nullifAI</w:t>
+      </w:r>
+      <w:r>
+        <w:rPr>
+          <w:b w:val="0"/>
+          <w:i w:val="0"/>
+          <w:color w:val="141821"/>
+          <w:sz w:val="21"/>
+        </w:rPr>
+        <w:t xml:space="preserve"> malicious models on Hugging Face (</w:t>
+      </w:r>
+      <w:hyperlink r:id="rId18">
+        <w:r>
+          <w:rPr>
+            <w:color w:val="2F6FED"/>
+            <w:u w:val="single"/>
+          </w:rPr>
+          <w:t xml:space="preserve">source</w:t>
+        </w:r>
+      </w:hyperlink>
+      <w:r>
+        <w:rPr>
+          <w:b w:val="0"/>
+          <w:i w:val="0"/>
+          <w:color w:val="141821"/>
+          <w:sz w:val="21"/>
+        </w:rPr>
+        <w:t>) crossed it: loading a poisoned artifact from a public hub executed attacker code inside the loading process. Family F5.</w:t>
       </w:r>
     </w:p>
     <w:p>
@@ -4575,7 +4575,7 @@
           <w:color w:val="141821"/>
           <w:sz w:val="21"/>
         </w:rPr>
-        <w:t xml:space="preserve">A single boundary crossing is usually a precondition, not a catastrophe. An injection that crosses TB1 but reaches no tool and no exfil channel is contained noise. Damage requires chaining. The pattern the security community calls the lethal trifecta is precisely this: TB1 (untrusted input becomes instruction) plus TB2 or TB3 (the instruction reaches an action or a durable store) plus an egress channel (the result leaves the org). EchoLeak chained TB1 to an exfil path. The confused-deputy class, </w:t>
+        <w:t xml:space="preserve">A single boundary crossing is usually a precondition, not a catastrophe. An injection that crosses TB1 but reaches no tool and no exfil channel is contained noise. Damage requires chaining. The pattern the security community calls the lethal trifecta is precisely this: TB1 (untrusted input becomes instruction) plus TB3 (the instruction reaches a real-world action) plus an egress channel (the result leaves the org). EchoLeak chained TB1 to an exfil path. The confused-deputy class, </w:t>
       </w:r>
       <w:r>
         <w:rPr>
@@ -4611,7 +4611,7 @@
           <w:color w:val="141821"/>
           <w:sz w:val="21"/>
         </w:rPr>
-        <w:t>), chained TB1 to TB4: untrusted text in a public issue drove the agent to use its over-broad standing access against private repositories.</w:t>
+        <w:t>), chained TB1 to TB3: untrusted text in a public issue drove the agent to make an over-scoped tool call against its own standing access, reading private repositories the requesting user could not.</w:t>
       </w:r>
     </w:p>
     <w:p>
@@ -4670,7 +4670,7 @@
           <w:color w:val="141821"/>
           <w:sz w:val="21"/>
         </w:rPr>
-        <w:t>) is the cleanest illustration of a multi-boundary chain, and it crossed three. TB1: injected instructions in ingested content. TB2: the model encoded private source code into an attacker-mappable URL. The egress: the client auto-fetched that URL through GitHub's own Camo image proxy with pre-generated HMAC tokens, a first-party, CSP-allowed, security-team-blessed channel. CSP held. The allowlist held. Both were irrelevant, because the exfil rode a trusted egress the org had already approved. The lesson the defender draws is structural: you do not stop these by reinforcing any single boundary. You stop them by refusing to co-locate the three preconditions in one agent or session.</w:t>
+        <w:t>) is the cleanest illustration of a multi-boundary chain, and it crossed three. TB1: injected instructions in ingested content. TB3: the model encoded private source code into an attacker-mappable URL. The egress: the client auto-fetched that URL through GitHub's own Camo image proxy with pre-generated HMAC tokens, a first-party, CSP-allowed, security-team-blessed channel. CSP held. The allowlist held. Both were irrelevant, because the exfil rode a trusted egress the org had already approved. The lesson the defender draws is structural: you do not stop these by reinforcing any single boundary. You stop them by refusing to co-locate the three preconditions in one agent or session.</w:t>
       </w:r>
     </w:p>
     <w:p>
@@ -4718,7 +4718,7 @@
         </w:rPr>
         <w:t xml:space="preserve"> maker-credentials gap (</w:t>
       </w:r>
-      <w:hyperlink r:id="rId29">
+      <w:hyperlink r:id="rId30">
         <w:r>
           <w:rPr>
             <w:color w:val="2F6FED"/>
@@ -4757,7 +4757,7 @@
                     <pic:cNvPicPr/>
                   </pic:nvPicPr>
                   <pic:blipFill>
-                    <a:blip r:embed="rId30"/>
+                    <a:blip r:embed="rId31"/>
                     <a:stretch>
                       <a:fillRect/>
                     </a:stretch>
@@ -4971,7 +4971,7 @@
                 <w:color w:val="3A0F0F"/>
                 <w:sz w:val="20"/>
               </w:rPr>
-              <w:t>The boundary model tells you which seams a request crosses, not whether a control on that seam actually holds. TB1 (prompt injection) and the latent-backdoor crossing of TB5 have no enforcing control: the checklist can mark them "assumed" forever, because no product moves them to "enforced." Plan for permanent residual exposure on those two, not eventual closure.</w:t>
+              <w:t>The boundary model tells you which seams a request crosses, not whether a control on that seam actually holds. TB1 (prompt injection) and the latent-backdoor crossing of TB2 have no enforcing control: the checklist can mark them "assumed" forever, because no product moves them to "enforced." Plan for permanent residual exposure on those two, not eventual closure.</w:t>
             </w:r>
           </w:p>
         </w:tc>
@@ -5009,7 +5009,7 @@
         </w:rPr>
         <w:t>The attack surface is the architecture, not a list of bugs. Every incident in this Part has a CVE or a named writeup, and patching each one individually is necessary and insufficient, because the next instance arrives through the same unpatched seam. EchoLeak got a fix; the TB1 boundary that made it possible is unchanged, and ShadowLeak (</w:t>
       </w:r>
-      <w:hyperlink r:id="rId31">
+      <w:hyperlink r:id="rId32">
         <w:r>
           <w:rPr>
             <w:color w:val="2F6FED"/>
@@ -5201,7 +5201,7 @@
                 <w:color w:val="12230F"/>
                 <w:sz w:val="20"/>
               </w:rPr>
-              <w:t>Risk concentrates at 7 trust boundaries, not inside the layers; high-severity incidents cross two or more (the lethal trifecta is TB1 plus TB2/TB3 plus an egress channel).</w:t>
+              <w:t>Risk concentrates at 7 trust boundaries, not inside the layers; high-severity incidents cross two or more (the lethal trifecta is TB1 plus TB3 plus an egress channel).</w:t>
             </w:r>
           </w:p>
           <w:p>
@@ -5245,7 +5245,7 @@
                 <w:color w:val="12230F"/>
                 <w:sz w:val="20"/>
               </w:rPr>
-              <w:t>"Assume injection succeeds" is the only honest posture: no control reliably separates instruction from data in one context window, and every classifier including XPIA has been bypassed.</w:t>
+              <w:t>"Assume injection succeeds" is the only honest posture: no control reliably separates instruction from data in one context window, and classifiers built to try, including XPIA, have been bypassed.</w:t>
             </w:r>
           </w:p>
           <w:p>
@@ -5267,7 +5267,7 @@
                 <w:color w:val="12230F"/>
                 <w:sz w:val="20"/>
               </w:rPr>
-              <w:t>Every attack family already has a real, named, in-the-wild example; this is a present-tense problem, not a forecast.</w:t>
+              <w:t>Every attack family has at least one real, named example; the injection, identity, and exfil families have in-the-wild incidents, while a few load-bearing examples (Morris II, Sleeper Agents, Agentic Misalignment) are controlled research demonstrations whose enabling conditions exist in production. This is a present-tense problem, not a forecast.</w:t>
             </w:r>
           </w:p>
         </w:tc>
@@ -5433,7 +5433,7 @@
           <w:color w:val="141821"/>
           <w:sz w:val="21"/>
         </w:rPr>
-        <w:t>Part 2 turns this map into a rigorous taxonomy of 31 risks, a survey of what the solution market actually covers, an honest accounting of where coverage is strong, partial, or absent, and an end-to-end control architecture that assumes the hardest problems stay unsolved.</w:t>
+        <w:t>Part 2 turns this map into a rigorous taxonomy of 42 risks, a survey of what the solution market actually covers, an honest accounting of where coverage is strong, partial, or absent, and an end-to-end control architecture that assumes the hardest problems stay unsolved.</w:t>
       </w:r>
     </w:p>
     <w:p>
@@ -5449,7 +5449,7 @@
         </w:rPr>
         <w:t xml:space="preserve">The interactive companion to both parts, with every layer, risk, validated example, and control as a clickable model, is published at </w:t>
       </w:r>
-      <w:hyperlink r:id="rId32">
+      <w:hyperlink r:id="rId33">
         <w:r>
           <w:rPr>
             <w:color w:val="2F6FED"/>

</xml_diff>

<commit_message>
Close code-security gaps: expand taxonomy to 50 risks (R43-R50: AI-generated insecure code, secure SDLC, patch/vuln management, runtime drift, lifecycle), add Move 9, end-to-end build-to-retire coverage
</commit_message>
<xml_diff>
--- a/whitepaper/Securing-the-Agentic-Enterprise-Part-1.docx
+++ b/whitepaper/Securing-the-Agentic-Enterprise-Part-1.docx
@@ -3333,13 +3333,13 @@
             <w:pPr>
               <w:spacing w:after="20"/>
             </w:pPr>
-            <w:hyperlink r:id="rId18">
+            <w:hyperlink r:id="rId29">
               <w:r>
                 <w:rPr>
                   <w:color w:val="2F6FED"/>
                   <w:u w:val="single"/>
                 </w:rPr>
-                <w:t xml:space="preserve">Malicious ML models discovered on Hugging Face platform (n...</w:t>
+                <w:t xml:space="preserve">ShadowRay 2.0: Attackers Turn AI Against Itself in Global ...</w:t>
               </w:r>
             </w:hyperlink>
           </w:p>
@@ -3367,7 +3367,7 @@
                 <w:color w:val="141821"/>
                 <w:sz w:val="19"/>
               </w:rPr>
-              <w:t>L11 L3</w:t>
+              <w:t>L11 L3 L2 L5</w:t>
             </w:r>
           </w:p>
         </w:tc>
@@ -3421,7 +3421,7 @@
                 <w:color w:val="141821"/>
                 <w:sz w:val="19"/>
               </w:rPr>
-              <w:t>High</w:t>
+              <w:t>Critical</w:t>
             </w:r>
           </w:p>
         </w:tc>
@@ -3751,7 +3751,7 @@
             <w:pPr>
               <w:spacing w:after="20"/>
             </w:pPr>
-            <w:hyperlink r:id="rId29">
+            <w:hyperlink r:id="rId30">
               <w:r>
                 <w:rPr>
                   <w:color w:val="2F6FED"/>
@@ -4718,7 +4718,7 @@
         </w:rPr>
         <w:t xml:space="preserve"> maker-credentials gap (</w:t>
       </w:r>
-      <w:hyperlink r:id="rId30">
+      <w:hyperlink r:id="rId31">
         <w:r>
           <w:rPr>
             <w:color w:val="2F6FED"/>
@@ -4757,7 +4757,7 @@
                     <pic:cNvPicPr/>
                   </pic:nvPicPr>
                   <pic:blipFill>
-                    <a:blip r:embed="rId31"/>
+                    <a:blip r:embed="rId32"/>
                     <a:stretch>
                       <a:fillRect/>
                     </a:stretch>
@@ -5009,7 +5009,7 @@
         </w:rPr>
         <w:t>The attack surface is the architecture, not a list of bugs. Every incident in this Part has a CVE or a named writeup, and patching each one individually is necessary and insufficient, because the next instance arrives through the same unpatched seam. EchoLeak got a fix; the TB1 boundary that made it possible is unchanged, and ShadowLeak (</w:t>
       </w:r>
-      <w:hyperlink r:id="rId32">
+      <w:hyperlink r:id="rId33">
         <w:r>
           <w:rPr>
             <w:color w:val="2F6FED"/>
@@ -5433,7 +5433,7 @@
           <w:color w:val="141821"/>
           <w:sz w:val="21"/>
         </w:rPr>
-        <w:t>Part 2 turns this map into a rigorous taxonomy of 42 risks, a survey of what the solution market actually covers, an honest accounting of where coverage is strong, partial, or absent, and an end-to-end control architecture that assumes the hardest problems stay unsolved.</w:t>
+        <w:t>Part 2 turns this map into a rigorous taxonomy of 50 risks, a survey of what the solution market actually covers, an honest accounting of where coverage is strong, partial, or absent, and an end-to-end control architecture that assumes the hardest problems stay unsolved.</w:t>
       </w:r>
     </w:p>
     <w:p>
@@ -5449,7 +5449,7 @@
         </w:rPr>
         <w:t xml:space="preserve">The interactive companion to both parts, with every layer, risk, validated example, and control as a clickable model, is published at </w:t>
       </w:r>
-      <w:hyperlink r:id="rId33">
+      <w:hyperlink r:id="rId34">
         <w:r>
           <w:rPr>
             <w:color w:val="2F6FED"/>

</xml_diff>